<commit_message>
Mark Epic with purple placeholder in first guide
Co-Authored-By: Claude Sonnet 5.5 <noreply@anthropic.com>
Claude-Session: https://claude.ai/code/session_01RxsNP8tKP1eXg4JoW8oJur
</commit_message>
<xml_diff>
--- a/deliverables/Epic_Training_Quick_Start_Guide_Outpatient_Clinician_Rooming_a_Patient.docx
+++ b/deliverables/Epic_Training_Quick_Start_Guide_Outpatient_Clinician_Rooming_a_Patient.docx
@@ -11008,7 +11008,20 @@
               <w:rPr>
                 <w:rStyle w:val="TipText"/>
               </w:rPr>
-              <w:t xml:space="preserve"> appears next to medications that do not have an exact match in Epic. For example, a patient might report a brand name medication but not its strength. When you click </w:t>
+              <w:t xml:space="preserve"> appears next to medications that do not have an exact match in </w:t>
+            </w:r>
+            <w:r>
+              <w:rPr>
+                <w:rStyle w:val="TipText"/>
+                <w:shd w:val="clear" w:color="auto" w:fill="C3A6F0"/>
+              </w:rPr>
+              <w:t xml:space="preserve">[Epic]</w:t>
+            </w:r>
+            <w:r>
+              <w:rPr>
+                <w:rStyle w:val="TipText"/>
+              </w:rPr>
+              <w:t xml:space="preserve">. For example, a patient might report a brand name medication but not its strength. When you click </w:t>
             </w:r>
             <w:r>
               <w:rPr>
@@ -13075,8 +13088,9 @@
         <w:spacing w:val="1"/>
         <w:sz w:val="32"/>
         <w:szCs w:val="32"/>
+        <w:shd w:val="clear" w:color="auto" w:fill="C3A6F0"/>
       </w:rPr>
-      <w:t>Epic</w:t>
+      <w:t>[Epic]</w:t>
     </w:r>
     <w:r>
       <w:rPr>

</xml_diff>

<commit_message>
Remove word Epic from first guide; blank purple placeholders
Co-Authored-By: Claude Sonnet 5.5 <noreply@anthropic.com>
Claude-Session: https://claude.ai/code/session_01RxsNP8tKP1eXg4JoW8oJur
</commit_message>
<xml_diff>
--- a/deliverables/Epic_Training_Quick_Start_Guide_Outpatient_Clinician_Rooming_a_Patient.docx
+++ b/deliverables/Epic_Training_Quick_Start_Guide_Outpatient_Clinician_Rooming_a_Patient.docx
@@ -11015,7 +11015,7 @@
                 <w:rStyle w:val="TipText"/>
                 <w:shd w:val="clear" w:color="auto" w:fill="C3A6F0"/>
               </w:rPr>
-              <w:t xml:space="preserve">[Epic]</w:t>
+              <w:t xml:space="preserve">[      ]</w:t>
             </w:r>
             <w:r>
               <w:rPr>
@@ -13090,7 +13090,7 @@
         <w:szCs w:val="32"/>
         <w:shd w:val="clear" w:color="auto" w:fill="C3A6F0"/>
       </w:rPr>
-      <w:t>[Epic]</w:t>
+      <w:t>[      ]</w:t>
     </w:r>
     <w:r>
       <w:rPr>

</xml_diff>